<commit_message>
W6-Archivfund ohne Krippe aus dem Plattformtitel: hebelistverbogen statt zeitreisebeendet; Test K8 zählt Plattform- und Epochentitel
- W6-A-01 und Akte W6·2 Auftrag 2: `BLJLF ASPPI VLIUI N` (Ring 3, Pendel UHR) → Zwischentext HESELTBI VBEEONRG →
  *hebelistverbogen*; Folie 2, Lehrerhinweise W6, Spec W6 (§0.1, §2, §12), Prüfwerte, Bibliothekstests (JS und
  Python-Zwilling), e2e Szenario 12 nachgezogen; Akte, Präsentation und Lehrerhinweise W6 neu gebaut samt PDFs
- test/inhalte_loesungsverrat: K8 prüft alle Klartexte (Lab, Boss, Archivfund, Papier) gegen die Wörter aus
  Plattformtitel und Epochentiteln
- FACHLICHE_KORREKTUREN D15 ergänzt

Co-Authored-By: Claude Opus 5.5 <noreply@anthropic.com>
Claude-Session: https://claude.ai/code/session_01JKXVQqFeKVmyQ9jfHw4db3
</commit_message>
<xml_diff>
--- a/materialien/00_Lehrerhinweise/KR_W6_Lehrerhinweise.docx
+++ b/materialien/00_Lehrerhinweise/KR_W6_Lehrerhinweise.docx
@@ -355,7 +355,7 @@
                 <w:color w:val="1B1B1F"/>
                 <w:sz w:val="22"/>
               </w:rPr>
-              <w:t>TAZLL ZZLYL VIHAV K</w:t>
+              <w:t>BLJLF ASPPI VLIUI N</w:t>
             </w:r>
             <w:r>
               <w:rPr>
@@ -375,7 +375,7 @@
                 <w:color w:val="1B1B1F"/>
                 <w:sz w:val="22"/>
               </w:rPr>
-              <w:t>zeitreisebeendet</w:t>
+              <w:t>hebelistverbogen</w:t>
             </w:r>
             <w:r>
               <w:rPr>

</xml_diff>